<commit_message>
doc: Atualiza a documentação de requisitos do projeto
</commit_message>
<xml_diff>
--- a/doc/Documentacao - Requisitos Funcionais.docx
+++ b/doc/Documentacao - Requisitos Funcionais.docx
@@ -1,6 +1,6 @@
 
 <file path=word/document.xml><?xml version="1.0" encoding="utf-8"?>
-<w:document xmlns:wpc="http://schemas.microsoft.com/office/word/2010/wordprocessingCanvas" xmlns:cx="http://schemas.microsoft.com/office/drawing/2014/chartex" xmlns:cx1="http://schemas.microsoft.com/office/drawing/2015/9/8/chartex" xmlns:cx2="http://schemas.microsoft.com/office/drawing/2015/10/21/chartex" xmlns:cx3="http://schemas.microsoft.com/office/drawing/2016/5/9/chartex" xmlns:cx4="http://schemas.microsoft.com/office/drawing/2016/5/10/chartex" xmlns:cx5="http://schemas.microsoft.com/office/drawing/2016/5/11/chartex" xmlns:cx6="http://schemas.microsoft.com/office/drawing/2016/5/12/chartex" xmlns:cx7="http://schemas.microsoft.com/office/drawing/2016/5/13/chartex" xmlns:cx8="http://schemas.microsoft.com/office/drawing/2016/5/14/chartex" xmlns:mc="http://schemas.openxmlformats.org/markup-compatibility/2006" xmlns:aink="http://schemas.microsoft.com/office/drawing/2016/ink" xmlns:am3d="http://schemas.microsoft.com/office/drawing/2017/model3d" xmlns:o="urn:schemas-microsoft-com:office:office" xmlns:oel="http://schemas.microsoft.com/office/2019/extlst" xmlns:r="http://schemas.openxmlformats.org/officeDocument/2006/relationships" xmlns:m="http://schemas.openxmlformats.org/officeDocument/2006/math" xmlns:v="urn:schemas-microsoft-com:vml" xmlns:wp14="http://schemas.microsoft.com/office/word/2010/wordprocessingDrawing" xmlns:wp="http://schemas.openxmlformats.org/drawingml/2006/wordprocessingDrawing" xmlns:w10="urn:schemas-microsoft-com:office:word" xmlns:w="http://schemas.openxmlformats.org/wordprocessingml/2006/main" xmlns:w14="http://schemas.microsoft.com/office/word/2010/wordml" xmlns:w15="http://schemas.microsoft.com/office/word/2012/wordml" xmlns:w16cex="http://schemas.microsoft.com/office/word/2018/wordml/cex" xmlns:w16cid="http://schemas.microsoft.com/office/word/2016/wordml/cid" xmlns:w16="http://schemas.microsoft.com/office/word/2018/wordml" xmlns:w16du="http://schemas.microsoft.com/office/word/2023/wordml/word16du" xmlns:w16sdtdh="http://schemas.microsoft.com/office/word/2020/wordml/sdtdatahash" xmlns:w16sdtfl="http://schemas.microsoft.com/office/word/2024/wordml/sdtformatlock" xmlns:w16se="http://schemas.microsoft.com/office/word/2015/wordml/symex" xmlns:wpg="http://schemas.microsoft.com/office/word/2010/wordprocessingGroup" xmlns:wpi="http://schemas.microsoft.com/office/word/2010/wordprocessingInk" xmlns:wne="http://schemas.microsoft.com/office/word/2006/wordml" xmlns:wps="http://schemas.microsoft.com/office/word/2010/wordprocessingShape" mc:Ignorable="w14 w15 w16se w16cid w16 w16cex w16sdtdh w16sdtfl w16du wp14">
+<w:document xmlns:wpc="http://schemas.microsoft.com/office/word/2010/wordprocessingCanvas" xmlns:cx="http://schemas.microsoft.com/office/drawing/2014/chartex" xmlns:cx1="http://schemas.microsoft.com/office/drawing/2015/9/8/chartex" xmlns:cx2="http://schemas.microsoft.com/office/drawing/2015/10/21/chartex" xmlns:cx3="http://schemas.microsoft.com/office/drawing/2016/5/9/chartex" xmlns:cx4="http://schemas.microsoft.com/office/drawing/2016/5/10/chartex" xmlns:cx5="http://schemas.microsoft.com/office/drawing/2016/5/11/chartex" xmlns:cx6="http://schemas.microsoft.com/office/drawing/2016/5/12/chartex" xmlns:cx7="http://schemas.microsoft.com/office/drawing/2016/5/13/chartex" xmlns:cx8="http://schemas.microsoft.com/office/drawing/2016/5/14/chartex" xmlns:mc="http://schemas.openxmlformats.org/markup-compatibility/2006" xmlns:aink="http://schemas.microsoft.com/office/drawing/2016/ink" xmlns:am3d="http://schemas.microsoft.com/office/drawing/2017/model3d" xmlns:o="urn:schemas-microsoft-com:office:office" xmlns:r="http://schemas.openxmlformats.org/officeDocument/2006/relationships" xmlns:m="http://schemas.openxmlformats.org/officeDocument/2006/math" xmlns:v="urn:schemas-microsoft-com:vml" xmlns:wp14="http://schemas.microsoft.com/office/word/2010/wordprocessingDrawing" xmlns:wp="http://schemas.openxmlformats.org/drawingml/2006/wordprocessingDrawing" xmlns:w10="urn:schemas-microsoft-com:office:word" xmlns:w="http://schemas.openxmlformats.org/wordprocessingml/2006/main" xmlns:w14="http://schemas.microsoft.com/office/word/2010/wordml" xmlns:w15="http://schemas.microsoft.com/office/word/2012/wordml" xmlns:w16cex="http://schemas.microsoft.com/office/word/2018/wordml/cex" xmlns:w16cid="http://schemas.microsoft.com/office/word/2016/wordml/cid" xmlns:w16="http://schemas.microsoft.com/office/word/2018/wordml" xmlns:w16sdtdh="http://schemas.microsoft.com/office/word/2020/wordml/sdtdatahash" xmlns:w16se="http://schemas.microsoft.com/office/word/2015/wordml/symex" xmlns:wpg="http://schemas.microsoft.com/office/word/2010/wordprocessingGroup" xmlns:wpi="http://schemas.microsoft.com/office/word/2010/wordprocessingInk" xmlns:wne="http://schemas.microsoft.com/office/word/2006/wordml" xmlns:wps="http://schemas.microsoft.com/office/word/2010/wordprocessingShape" mc:Ignorable="w14 w15 w16se w16cid w16 w16cex w16sdtdh wp14">
   <w:body>
     <w:tbl>
       <w:tblPr>
@@ -274,7 +274,59 @@
                 <w:sz w:val="24"/>
                 <w:szCs w:val="24"/>
               </w:rPr>
-              <w:t>Item -1-  Tela de Cadastro</w:t>
+              <w:t>Item -</w:t>
+            </w:r>
+            <w:r>
+              <w:rPr>
+                <w:rFonts w:ascii="Verdana" w:hAnsi="Verdana"/>
+                <w:b/>
+                <w:bCs/>
+                <w:sz w:val="24"/>
+                <w:szCs w:val="24"/>
+              </w:rPr>
+              <w:t xml:space="preserve"> </w:t>
+            </w:r>
+            <w:r>
+              <w:rPr>
+                <w:rFonts w:ascii="Verdana" w:hAnsi="Verdana"/>
+                <w:b/>
+                <w:bCs/>
+                <w:sz w:val="24"/>
+                <w:szCs w:val="24"/>
+              </w:rPr>
+              <w:t>1</w:t>
+            </w:r>
+            <w:r>
+              <w:rPr>
+                <w:rFonts w:ascii="Verdana" w:hAnsi="Verdana"/>
+                <w:b/>
+                <w:bCs/>
+                <w:sz w:val="24"/>
+                <w:szCs w:val="24"/>
+              </w:rPr>
+              <w:t xml:space="preserve"> </w:t>
+            </w:r>
+            <w:proofErr w:type="gramStart"/>
+            <w:r>
+              <w:rPr>
+                <w:rFonts w:ascii="Verdana" w:hAnsi="Verdana"/>
+                <w:b/>
+                <w:bCs/>
+                <w:sz w:val="24"/>
+                <w:szCs w:val="24"/>
+              </w:rPr>
+              <w:t>-  Tela</w:t>
+            </w:r>
+            <w:proofErr w:type="gramEnd"/>
+            <w:r>
+              <w:rPr>
+                <w:rFonts w:ascii="Verdana" w:hAnsi="Verdana"/>
+                <w:b/>
+                <w:bCs/>
+                <w:sz w:val="24"/>
+                <w:szCs w:val="24"/>
+              </w:rPr>
+              <w:t xml:space="preserve"> de Cadastro</w:t>
             </w:r>
           </w:p>
         </w:tc>
@@ -639,7 +691,47 @@
                 <w:sz w:val="24"/>
                 <w:szCs w:val="24"/>
               </w:rPr>
-              <w:t>Item -2- Tela de login</w:t>
+              <w:t>Item -</w:t>
+            </w:r>
+            <w:r>
+              <w:rPr>
+                <w:rFonts w:ascii="Verdana" w:hAnsi="Verdana"/>
+                <w:b/>
+                <w:bCs/>
+                <w:sz w:val="24"/>
+                <w:szCs w:val="24"/>
+              </w:rPr>
+              <w:t xml:space="preserve"> </w:t>
+            </w:r>
+            <w:r>
+              <w:rPr>
+                <w:rFonts w:ascii="Verdana" w:hAnsi="Verdana"/>
+                <w:b/>
+                <w:bCs/>
+                <w:sz w:val="24"/>
+                <w:szCs w:val="24"/>
+              </w:rPr>
+              <w:t>2</w:t>
+            </w:r>
+            <w:r>
+              <w:rPr>
+                <w:rFonts w:ascii="Verdana" w:hAnsi="Verdana"/>
+                <w:b/>
+                <w:bCs/>
+                <w:sz w:val="24"/>
+                <w:szCs w:val="24"/>
+              </w:rPr>
+              <w:t xml:space="preserve"> </w:t>
+            </w:r>
+            <w:r>
+              <w:rPr>
+                <w:rFonts w:ascii="Verdana" w:hAnsi="Verdana"/>
+                <w:b/>
+                <w:bCs/>
+                <w:sz w:val="24"/>
+                <w:szCs w:val="24"/>
+              </w:rPr>
+              <w:t>- Tela de login</w:t>
             </w:r>
           </w:p>
         </w:tc>
@@ -824,7 +916,7 @@
                 <w:sz w:val="24"/>
                 <w:szCs w:val="24"/>
               </w:rPr>
-              <w:t>E-mail</w:t>
+              <w:t>CPF</w:t>
             </w:r>
             <w:r>
               <w:rPr>
@@ -850,7 +942,17 @@
                 <w:sz w:val="24"/>
                 <w:szCs w:val="24"/>
               </w:rPr>
-              <w:t xml:space="preserve">senha </w:t>
+              <w:t>S</w:t>
+            </w:r>
+            <w:r>
+              <w:rPr>
+                <w:rFonts w:ascii="Verdana" w:hAnsi="Verdana"/>
+                <w:b/>
+                <w:bCs/>
+                <w:sz w:val="24"/>
+                <w:szCs w:val="24"/>
+              </w:rPr>
+              <w:t xml:space="preserve">enha </w:t>
             </w:r>
             <w:r>
               <w:rPr>
@@ -859,6 +961,14 @@
                 <w:szCs w:val="24"/>
               </w:rPr>
               <w:t>utilizados no cadastro</w:t>
+            </w:r>
+            <w:r>
+              <w:rPr>
+                <w:rFonts w:ascii="Verdana" w:hAnsi="Verdana"/>
+                <w:sz w:val="24"/>
+                <w:szCs w:val="24"/>
+              </w:rPr>
+              <w:t>.</w:t>
             </w:r>
           </w:p>
         </w:tc>
@@ -910,18 +1020,64 @@
                 <w:bCs/>
                 <w:sz w:val="24"/>
                 <w:szCs w:val="24"/>
-              </w:rPr>
-            </w:pPr>
-            <w:r>
-              <w:rPr>
-                <w:rFonts w:ascii="Verdana" w:hAnsi="Verdana"/>
-                <w:b/>
-                <w:bCs/>
-                <w:sz w:val="24"/>
-                <w:szCs w:val="24"/>
+                <w:u w:val="single"/>
+              </w:rPr>
+            </w:pPr>
+            <w:r>
+              <w:rPr>
+                <w:rFonts w:ascii="Verdana" w:hAnsi="Verdana"/>
+                <w:b/>
+                <w:bCs/>
+                <w:sz w:val="24"/>
+                <w:szCs w:val="24"/>
+                <w:u w:val="single"/>
               </w:rPr>
               <w:lastRenderedPageBreak/>
-              <w:t>Item -3- Estoque</w:t>
+              <w:t xml:space="preserve">Item </w:t>
+            </w:r>
+            <w:r>
+              <w:rPr>
+                <w:rFonts w:ascii="Verdana" w:hAnsi="Verdana"/>
+                <w:b/>
+                <w:bCs/>
+                <w:sz w:val="24"/>
+                <w:szCs w:val="24"/>
+                <w:u w:val="single"/>
+              </w:rPr>
+              <w:t xml:space="preserve">– </w:t>
+            </w:r>
+            <w:r>
+              <w:rPr>
+                <w:rFonts w:ascii="Verdana" w:hAnsi="Verdana"/>
+                <w:b/>
+                <w:bCs/>
+                <w:sz w:val="24"/>
+                <w:szCs w:val="24"/>
+                <w:u w:val="single"/>
+              </w:rPr>
+              <w:t>3</w:t>
+            </w:r>
+            <w:r>
+              <w:rPr>
+                <w:rFonts w:ascii="Verdana" w:hAnsi="Verdana"/>
+                <w:b/>
+                <w:bCs/>
+                <w:sz w:val="24"/>
+                <w:szCs w:val="24"/>
+                <w:u w:val="single"/>
+              </w:rPr>
+              <w:t xml:space="preserve"> </w:t>
+            </w:r>
+            <w:r>
+              <w:rPr>
+                <w:rFonts w:ascii="Verdana" w:hAnsi="Verdana"/>
+                <w:b/>
+                <w:bCs/>
+                <w:sz w:val="24"/>
+                <w:szCs w:val="24"/>
+                <w:u w:val="single"/>
+              </w:rPr>
+              <w:t>- Estoque</w:t>
             </w:r>
           </w:p>
         </w:tc>
@@ -1158,7 +1314,7 @@
                 <w:sz w:val="24"/>
                 <w:szCs w:val="24"/>
               </w:rPr>
-              <w:t>deletar</w:t>
+              <w:t>descartar</w:t>
             </w:r>
             <w:r>
               <w:rPr>
@@ -1224,7 +1380,17 @@
                 <w:sz w:val="24"/>
                 <w:szCs w:val="24"/>
               </w:rPr>
-              <w:t>gerenciamento</w:t>
+              <w:t>G</w:t>
+            </w:r>
+            <w:r>
+              <w:rPr>
+                <w:rFonts w:ascii="Verdana" w:hAnsi="Verdana"/>
+                <w:b/>
+                <w:bCs/>
+                <w:sz w:val="24"/>
+                <w:szCs w:val="24"/>
+              </w:rPr>
+              <w:t>erenciamento</w:t>
             </w:r>
           </w:p>
         </w:tc>
@@ -1244,7 +1410,13 @@
               <w:rPr>
                 <w:rFonts w:ascii="Verdana" w:eastAsia="Verdana" w:hAnsi="Verdana" w:cs="Verdana"/>
               </w:rPr>
-              <w:t xml:space="preserve">No gerenciamento de estoque, qualquer usuário cadastrado no sistema pode </w:t>
+              <w:t>Q</w:t>
+            </w:r>
+            <w:r>
+              <w:rPr>
+                <w:rFonts w:ascii="Verdana" w:eastAsia="Verdana" w:hAnsi="Verdana" w:cs="Verdana"/>
+              </w:rPr>
+              <w:t xml:space="preserve">ualquer usuário cadastrado no sistema pode </w:t>
             </w:r>
             <w:r>
               <w:rPr>
@@ -1327,7 +1499,47 @@
                 <w:sz w:val="24"/>
                 <w:szCs w:val="24"/>
               </w:rPr>
-              <w:t>Item -4- Doces</w:t>
+              <w:t>Item -</w:t>
+            </w:r>
+            <w:r>
+              <w:rPr>
+                <w:rFonts w:ascii="Verdana" w:hAnsi="Verdana"/>
+                <w:b/>
+                <w:bCs/>
+                <w:sz w:val="24"/>
+                <w:szCs w:val="24"/>
+              </w:rPr>
+              <w:t xml:space="preserve"> </w:t>
+            </w:r>
+            <w:r>
+              <w:rPr>
+                <w:rFonts w:ascii="Verdana" w:hAnsi="Verdana"/>
+                <w:b/>
+                <w:bCs/>
+                <w:sz w:val="24"/>
+                <w:szCs w:val="24"/>
+              </w:rPr>
+              <w:t>4</w:t>
+            </w:r>
+            <w:r>
+              <w:rPr>
+                <w:rFonts w:ascii="Verdana" w:hAnsi="Verdana"/>
+                <w:b/>
+                <w:bCs/>
+                <w:sz w:val="24"/>
+                <w:szCs w:val="24"/>
+              </w:rPr>
+              <w:t xml:space="preserve"> </w:t>
+            </w:r>
+            <w:r>
+              <w:rPr>
+                <w:rFonts w:ascii="Verdana" w:hAnsi="Verdana"/>
+                <w:b/>
+                <w:bCs/>
+                <w:sz w:val="24"/>
+                <w:szCs w:val="24"/>
+              </w:rPr>
+              <w:t>- Doces</w:t>
             </w:r>
           </w:p>
         </w:tc>
@@ -1724,7 +1936,7 @@
 </file>
 
 <file path=word/endnotes.xml><?xml version="1.0" encoding="utf-8"?>
-<w:endnotes xmlns:wpc="http://schemas.microsoft.com/office/word/2010/wordprocessingCanvas" xmlns:cx="http://schemas.microsoft.com/office/drawing/2014/chartex" xmlns:cx1="http://schemas.microsoft.com/office/drawing/2015/9/8/chartex" xmlns:cx2="http://schemas.microsoft.com/office/drawing/2015/10/21/chartex" xmlns:cx3="http://schemas.microsoft.com/office/drawing/2016/5/9/chartex" xmlns:cx4="http://schemas.microsoft.com/office/drawing/2016/5/10/chartex" xmlns:cx5="http://schemas.microsoft.com/office/drawing/2016/5/11/chartex" xmlns:cx6="http://schemas.microsoft.com/office/drawing/2016/5/12/chartex" xmlns:cx7="http://schemas.microsoft.com/office/drawing/2016/5/13/chartex" xmlns:cx8="http://schemas.microsoft.com/office/drawing/2016/5/14/chartex" xmlns:mc="http://schemas.openxmlformats.org/markup-compatibility/2006" xmlns:aink="http://schemas.microsoft.com/office/drawing/2016/ink" xmlns:am3d="http://schemas.microsoft.com/office/drawing/2017/model3d" xmlns:o="urn:schemas-microsoft-com:office:office" xmlns:oel="http://schemas.microsoft.com/office/2019/extlst" xmlns:r="http://schemas.openxmlformats.org/officeDocument/2006/relationships" xmlns:m="http://schemas.openxmlformats.org/officeDocument/2006/math" xmlns:v="urn:schemas-microsoft-com:vml" xmlns:wp14="http://schemas.microsoft.com/office/word/2010/wordprocessingDrawing" xmlns:wp="http://schemas.openxmlformats.org/drawingml/2006/wordprocessingDrawing" xmlns:w10="urn:schemas-microsoft-com:office:word" xmlns:w="http://schemas.openxmlformats.org/wordprocessingml/2006/main" xmlns:w14="http://schemas.microsoft.com/office/word/2010/wordml" xmlns:w15="http://schemas.microsoft.com/office/word/2012/wordml" xmlns:w16cex="http://schemas.microsoft.com/office/word/2018/wordml/cex" xmlns:w16cid="http://schemas.microsoft.com/office/word/2016/wordml/cid" xmlns:w16="http://schemas.microsoft.com/office/word/2018/wordml" xmlns:w16du="http://schemas.microsoft.com/office/word/2023/wordml/word16du" xmlns:w16sdtdh="http://schemas.microsoft.com/office/word/2020/wordml/sdtdatahash" xmlns:w16sdtfl="http://schemas.microsoft.com/office/word/2024/wordml/sdtformatlock" xmlns:w16se="http://schemas.microsoft.com/office/word/2015/wordml/symex" xmlns:wpg="http://schemas.microsoft.com/office/word/2010/wordprocessingGroup" xmlns:wpi="http://schemas.microsoft.com/office/word/2010/wordprocessingInk" xmlns:wne="http://schemas.microsoft.com/office/word/2006/wordml" xmlns:wps="http://schemas.microsoft.com/office/word/2010/wordprocessingShape" mc:Ignorable="w14 w15 w16se w16cid w16 w16cex w16sdtdh w16sdtfl w16du wp14">
+<w:endnotes xmlns:wpc="http://schemas.microsoft.com/office/word/2010/wordprocessingCanvas" xmlns:cx="http://schemas.microsoft.com/office/drawing/2014/chartex" xmlns:cx1="http://schemas.microsoft.com/office/drawing/2015/9/8/chartex" xmlns:cx2="http://schemas.microsoft.com/office/drawing/2015/10/21/chartex" xmlns:cx3="http://schemas.microsoft.com/office/drawing/2016/5/9/chartex" xmlns:cx4="http://schemas.microsoft.com/office/drawing/2016/5/10/chartex" xmlns:cx5="http://schemas.microsoft.com/office/drawing/2016/5/11/chartex" xmlns:cx6="http://schemas.microsoft.com/office/drawing/2016/5/12/chartex" xmlns:cx7="http://schemas.microsoft.com/office/drawing/2016/5/13/chartex" xmlns:cx8="http://schemas.microsoft.com/office/drawing/2016/5/14/chartex" xmlns:mc="http://schemas.openxmlformats.org/markup-compatibility/2006" xmlns:aink="http://schemas.microsoft.com/office/drawing/2016/ink" xmlns:am3d="http://schemas.microsoft.com/office/drawing/2017/model3d" xmlns:o="urn:schemas-microsoft-com:office:office" xmlns:r="http://schemas.openxmlformats.org/officeDocument/2006/relationships" xmlns:m="http://schemas.openxmlformats.org/officeDocument/2006/math" xmlns:v="urn:schemas-microsoft-com:vml" xmlns:wp14="http://schemas.microsoft.com/office/word/2010/wordprocessingDrawing" xmlns:wp="http://schemas.openxmlformats.org/drawingml/2006/wordprocessingDrawing" xmlns:w10="urn:schemas-microsoft-com:office:word" xmlns:w="http://schemas.openxmlformats.org/wordprocessingml/2006/main" xmlns:w14="http://schemas.microsoft.com/office/word/2010/wordml" xmlns:w15="http://schemas.microsoft.com/office/word/2012/wordml" xmlns:w16cex="http://schemas.microsoft.com/office/word/2018/wordml/cex" xmlns:w16cid="http://schemas.microsoft.com/office/word/2016/wordml/cid" xmlns:w16="http://schemas.microsoft.com/office/word/2018/wordml" xmlns:w16sdtdh="http://schemas.microsoft.com/office/word/2020/wordml/sdtdatahash" xmlns:w16se="http://schemas.microsoft.com/office/word/2015/wordml/symex" xmlns:wpg="http://schemas.microsoft.com/office/word/2010/wordprocessingGroup" xmlns:wpi="http://schemas.microsoft.com/office/word/2010/wordprocessingInk" xmlns:wne="http://schemas.microsoft.com/office/word/2006/wordml" xmlns:wps="http://schemas.microsoft.com/office/word/2010/wordprocessingShape" mc:Ignorable="w14 w15 w16se w16cid w16 w16cex w16sdtdh wp14">
   <w:endnote w:type="separator" w:id="-1">
     <w:p>
       <w:pPr>
@@ -1749,7 +1961,7 @@
 </file>
 
 <file path=word/footnotes.xml><?xml version="1.0" encoding="utf-8"?>
-<w:footnotes xmlns:wpc="http://schemas.microsoft.com/office/word/2010/wordprocessingCanvas" xmlns:cx="http://schemas.microsoft.com/office/drawing/2014/chartex" xmlns:cx1="http://schemas.microsoft.com/office/drawing/2015/9/8/chartex" xmlns:cx2="http://schemas.microsoft.com/office/drawing/2015/10/21/chartex" xmlns:cx3="http://schemas.microsoft.com/office/drawing/2016/5/9/chartex" xmlns:cx4="http://schemas.microsoft.com/office/drawing/2016/5/10/chartex" xmlns:cx5="http://schemas.microsoft.com/office/drawing/2016/5/11/chartex" xmlns:cx6="http://schemas.microsoft.com/office/drawing/2016/5/12/chartex" xmlns:cx7="http://schemas.microsoft.com/office/drawing/2016/5/13/chartex" xmlns:cx8="http://schemas.microsoft.com/office/drawing/2016/5/14/chartex" xmlns:mc="http://schemas.openxmlformats.org/markup-compatibility/2006" xmlns:aink="http://schemas.microsoft.com/office/drawing/2016/ink" xmlns:am3d="http://schemas.microsoft.com/office/drawing/2017/model3d" xmlns:o="urn:schemas-microsoft-com:office:office" xmlns:oel="http://schemas.microsoft.com/office/2019/extlst" xmlns:r="http://schemas.openxmlformats.org/officeDocument/2006/relationships" xmlns:m="http://schemas.openxmlformats.org/officeDocument/2006/math" xmlns:v="urn:schemas-microsoft-com:vml" xmlns:wp14="http://schemas.microsoft.com/office/word/2010/wordprocessingDrawing" xmlns:wp="http://schemas.openxmlformats.org/drawingml/2006/wordprocessingDrawing" xmlns:w10="urn:schemas-microsoft-com:office:word" xmlns:w="http://schemas.openxmlformats.org/wordprocessingml/2006/main" xmlns:w14="http://schemas.microsoft.com/office/word/2010/wordml" xmlns:w15="http://schemas.microsoft.com/office/word/2012/wordml" xmlns:w16cex="http://schemas.microsoft.com/office/word/2018/wordml/cex" xmlns:w16cid="http://schemas.microsoft.com/office/word/2016/wordml/cid" xmlns:w16="http://schemas.microsoft.com/office/word/2018/wordml" xmlns:w16du="http://schemas.microsoft.com/office/word/2023/wordml/word16du" xmlns:w16sdtdh="http://schemas.microsoft.com/office/word/2020/wordml/sdtdatahash" xmlns:w16sdtfl="http://schemas.microsoft.com/office/word/2024/wordml/sdtformatlock" xmlns:w16se="http://schemas.microsoft.com/office/word/2015/wordml/symex" xmlns:wpg="http://schemas.microsoft.com/office/word/2010/wordprocessingGroup" xmlns:wpi="http://schemas.microsoft.com/office/word/2010/wordprocessingInk" xmlns:wne="http://schemas.microsoft.com/office/word/2006/wordml" xmlns:wps="http://schemas.microsoft.com/office/word/2010/wordprocessingShape" mc:Ignorable="w14 w15 w16se w16cid w16 w16cex w16sdtdh w16sdtfl w16du wp14">
+<w:footnotes xmlns:wpc="http://schemas.microsoft.com/office/word/2010/wordprocessingCanvas" xmlns:cx="http://schemas.microsoft.com/office/drawing/2014/chartex" xmlns:cx1="http://schemas.microsoft.com/office/drawing/2015/9/8/chartex" xmlns:cx2="http://schemas.microsoft.com/office/drawing/2015/10/21/chartex" xmlns:cx3="http://schemas.microsoft.com/office/drawing/2016/5/9/chartex" xmlns:cx4="http://schemas.microsoft.com/office/drawing/2016/5/10/chartex" xmlns:cx5="http://schemas.microsoft.com/office/drawing/2016/5/11/chartex" xmlns:cx6="http://schemas.microsoft.com/office/drawing/2016/5/12/chartex" xmlns:cx7="http://schemas.microsoft.com/office/drawing/2016/5/13/chartex" xmlns:cx8="http://schemas.microsoft.com/office/drawing/2016/5/14/chartex" xmlns:mc="http://schemas.openxmlformats.org/markup-compatibility/2006" xmlns:aink="http://schemas.microsoft.com/office/drawing/2016/ink" xmlns:am3d="http://schemas.microsoft.com/office/drawing/2017/model3d" xmlns:o="urn:schemas-microsoft-com:office:office" xmlns:r="http://schemas.openxmlformats.org/officeDocument/2006/relationships" xmlns:m="http://schemas.openxmlformats.org/officeDocument/2006/math" xmlns:v="urn:schemas-microsoft-com:vml" xmlns:wp14="http://schemas.microsoft.com/office/word/2010/wordprocessingDrawing" xmlns:wp="http://schemas.openxmlformats.org/drawingml/2006/wordprocessingDrawing" xmlns:w10="urn:schemas-microsoft-com:office:word" xmlns:w="http://schemas.openxmlformats.org/wordprocessingml/2006/main" xmlns:w14="http://schemas.microsoft.com/office/word/2010/wordml" xmlns:w15="http://schemas.microsoft.com/office/word/2012/wordml" xmlns:w16cex="http://schemas.microsoft.com/office/word/2018/wordml/cex" xmlns:w16cid="http://schemas.microsoft.com/office/word/2016/wordml/cid" xmlns:w16="http://schemas.microsoft.com/office/word/2018/wordml" xmlns:w16sdtdh="http://schemas.microsoft.com/office/word/2020/wordml/sdtdatahash" xmlns:w16se="http://schemas.microsoft.com/office/word/2015/wordml/symex" xmlns:wpg="http://schemas.microsoft.com/office/word/2010/wordprocessingGroup" xmlns:wpi="http://schemas.microsoft.com/office/word/2010/wordprocessingInk" xmlns:wne="http://schemas.microsoft.com/office/word/2006/wordml" xmlns:wps="http://schemas.microsoft.com/office/word/2010/wordprocessingShape" mc:Ignorable="w14 w15 w16se w16cid w16 w16cex w16sdtdh wp14">
   <w:footnote w:type="separator" w:id="-1">
     <w:p>
       <w:pPr>
@@ -1774,11 +1986,11 @@
 </file>
 
 <file path=word/header1.xml><?xml version="1.0" encoding="utf-8"?>
-<w:hdr xmlns:wpc="http://schemas.microsoft.com/office/word/2010/wordprocessingCanvas" xmlns:cx="http://schemas.microsoft.com/office/drawing/2014/chartex" xmlns:cx1="http://schemas.microsoft.com/office/drawing/2015/9/8/chartex" xmlns:cx2="http://schemas.microsoft.com/office/drawing/2015/10/21/chartex" xmlns:cx3="http://schemas.microsoft.com/office/drawing/2016/5/9/chartex" xmlns:cx4="http://schemas.microsoft.com/office/drawing/2016/5/10/chartex" xmlns:cx5="http://schemas.microsoft.com/office/drawing/2016/5/11/chartex" xmlns:cx6="http://schemas.microsoft.com/office/drawing/2016/5/12/chartex" xmlns:cx7="http://schemas.microsoft.com/office/drawing/2016/5/13/chartex" xmlns:cx8="http://schemas.microsoft.com/office/drawing/2016/5/14/chartex" xmlns:mc="http://schemas.openxmlformats.org/markup-compatibility/2006" xmlns:aink="http://schemas.microsoft.com/office/drawing/2016/ink" xmlns:am3d="http://schemas.microsoft.com/office/drawing/2017/model3d" xmlns:o="urn:schemas-microsoft-com:office:office" xmlns:oel="http://schemas.microsoft.com/office/2019/extlst" xmlns:r="http://schemas.openxmlformats.org/officeDocument/2006/relationships" xmlns:m="http://schemas.openxmlformats.org/officeDocument/2006/math" xmlns:v="urn:schemas-microsoft-com:vml" xmlns:wp14="http://schemas.microsoft.com/office/word/2010/wordprocessingDrawing" xmlns:wp="http://schemas.openxmlformats.org/drawingml/2006/wordprocessingDrawing" xmlns:w10="urn:schemas-microsoft-com:office:word" xmlns:w="http://schemas.openxmlformats.org/wordprocessingml/2006/main" xmlns:w14="http://schemas.microsoft.com/office/word/2010/wordml" xmlns:w15="http://schemas.microsoft.com/office/word/2012/wordml" xmlns:w16cex="http://schemas.microsoft.com/office/word/2018/wordml/cex" xmlns:w16cid="http://schemas.microsoft.com/office/word/2016/wordml/cid" xmlns:w16="http://schemas.microsoft.com/office/word/2018/wordml" xmlns:w16du="http://schemas.microsoft.com/office/word/2023/wordml/word16du" xmlns:w16sdtdh="http://schemas.microsoft.com/office/word/2020/wordml/sdtdatahash" xmlns:w16sdtfl="http://schemas.microsoft.com/office/word/2024/wordml/sdtformatlock" xmlns:w16se="http://schemas.microsoft.com/office/word/2015/wordml/symex" xmlns:wpg="http://schemas.microsoft.com/office/word/2010/wordprocessingGroup" xmlns:wpi="http://schemas.microsoft.com/office/word/2010/wordprocessingInk" xmlns:wne="http://schemas.microsoft.com/office/word/2006/wordml" xmlns:wps="http://schemas.microsoft.com/office/word/2010/wordprocessingShape" mc:Ignorable="w14 w15 w16se w16cid w16 w16cex w16sdtdh w16sdtfl w16du wp14">
+<w:hdr xmlns:wpc="http://schemas.microsoft.com/office/word/2010/wordprocessingCanvas" xmlns:cx="http://schemas.microsoft.com/office/drawing/2014/chartex" xmlns:cx1="http://schemas.microsoft.com/office/drawing/2015/9/8/chartex" xmlns:cx2="http://schemas.microsoft.com/office/drawing/2015/10/21/chartex" xmlns:cx3="http://schemas.microsoft.com/office/drawing/2016/5/9/chartex" xmlns:cx4="http://schemas.microsoft.com/office/drawing/2016/5/10/chartex" xmlns:cx5="http://schemas.microsoft.com/office/drawing/2016/5/11/chartex" xmlns:cx6="http://schemas.microsoft.com/office/drawing/2016/5/12/chartex" xmlns:cx7="http://schemas.microsoft.com/office/drawing/2016/5/13/chartex" xmlns:cx8="http://schemas.microsoft.com/office/drawing/2016/5/14/chartex" xmlns:mc="http://schemas.openxmlformats.org/markup-compatibility/2006" xmlns:aink="http://schemas.microsoft.com/office/drawing/2016/ink" xmlns:am3d="http://schemas.microsoft.com/office/drawing/2017/model3d" xmlns:o="urn:schemas-microsoft-com:office:office" xmlns:r="http://schemas.openxmlformats.org/officeDocument/2006/relationships" xmlns:m="http://schemas.openxmlformats.org/officeDocument/2006/math" xmlns:v="urn:schemas-microsoft-com:vml" xmlns:wp14="http://schemas.microsoft.com/office/word/2010/wordprocessingDrawing" xmlns:wp="http://schemas.openxmlformats.org/drawingml/2006/wordprocessingDrawing" xmlns:w10="urn:schemas-microsoft-com:office:word" xmlns:w="http://schemas.openxmlformats.org/wordprocessingml/2006/main" xmlns:w14="http://schemas.microsoft.com/office/word/2010/wordml" xmlns:w15="http://schemas.microsoft.com/office/word/2012/wordml" xmlns:w16cex="http://schemas.microsoft.com/office/word/2018/wordml/cex" xmlns:w16cid="http://schemas.microsoft.com/office/word/2016/wordml/cid" xmlns:w16="http://schemas.microsoft.com/office/word/2018/wordml" xmlns:w16sdtdh="http://schemas.microsoft.com/office/word/2020/wordml/sdtdatahash" xmlns:w16se="http://schemas.microsoft.com/office/word/2015/wordml/symex" xmlns:wpg="http://schemas.microsoft.com/office/word/2010/wordprocessingGroup" xmlns:wpi="http://schemas.microsoft.com/office/word/2010/wordprocessingInk" xmlns:wne="http://schemas.microsoft.com/office/word/2006/wordml" xmlns:wps="http://schemas.microsoft.com/office/word/2010/wordprocessingShape" mc:Ignorable="w14 w15 w16se w16cid w16 w16cex w16sdtdh wp14">
   <w:tbl>
     <w:tblPr>
-      <w:tblW w:w="0" w:type="auto"/>
-      <w:tblInd w:w="109" w:type="dxa"/>
+      <w:tblW w:w="8642" w:type="dxa"/>
+      <w:jc w:val="center"/>
       <w:tblBorders>
         <w:top w:val="single" w:sz="4" w:space="0" w:color="auto"/>
         <w:left w:val="single" w:sz="4" w:space="0" w:color="auto"/>
@@ -1794,51 +2006,92 @@
       <w:tblLook w:val="0000" w:firstRow="0" w:lastRow="0" w:firstColumn="0" w:lastColumn="0" w:noHBand="0" w:noVBand="0"/>
     </w:tblPr>
     <w:tblGrid>
-      <w:gridCol w:w="2205"/>
-      <w:gridCol w:w="1650"/>
-      <w:gridCol w:w="3261"/>
+      <w:gridCol w:w="3882"/>
+      <w:gridCol w:w="1565"/>
+      <w:gridCol w:w="3195"/>
     </w:tblGrid>
     <w:tr>
       <w:trPr>
         <w:trHeight w:val="315"/>
+        <w:jc w:val="center"/>
       </w:trPr>
       <w:tc>
         <w:tcPr>
-          <w:tcW w:w="2205" w:type="dxa"/>
+          <w:tcW w:w="3882" w:type="dxa"/>
         </w:tcPr>
         <w:p>
           <w:pPr>
-            <w:pStyle w:val="Cabealho"/>
+            <w:pStyle w:val="NormalWeb"/>
+            <w:jc w:val="center"/>
+          </w:pPr>
+          <w:r>
             <w:rPr>
-              <w:b/>
-              <w:bCs/>
+              <w:noProof/>
             </w:rPr>
-          </w:pPr>
+            <w:drawing>
+              <wp:inline distT="0" distB="0" distL="0" distR="0" wp14:anchorId="189678F4" wp14:editId="5FAAE9AD">
+                <wp:extent cx="466725" cy="418153"/>
+                <wp:effectExtent l="0" t="0" r="0" b="1270"/>
+                <wp:docPr id="1" name="Imagem 1"/>
+                <wp:cNvGraphicFramePr>
+                  <a:graphicFrameLocks xmlns:a="http://schemas.openxmlformats.org/drawingml/2006/main" noChangeAspect="1"/>
+                </wp:cNvGraphicFramePr>
+                <a:graphic xmlns:a="http://schemas.openxmlformats.org/drawingml/2006/main">
+                  <a:graphicData uri="http://schemas.openxmlformats.org/drawingml/2006/picture">
+                    <pic:pic xmlns:pic="http://schemas.openxmlformats.org/drawingml/2006/picture">
+                      <pic:nvPicPr>
+                        <pic:cNvPr id="0" name="Picture 1"/>
+                        <pic:cNvPicPr>
+                          <a:picLocks noChangeAspect="1" noChangeArrowheads="1"/>
+                        </pic:cNvPicPr>
+                      </pic:nvPicPr>
+                      <pic:blipFill>
+                        <a:blip r:embed="rId1">
+                          <a:extLst>
+                            <a:ext uri="{28A0092B-C50C-407E-A947-70E740481C1C}">
+                              <a14:useLocalDpi xmlns:a14="http://schemas.microsoft.com/office/drawing/2010/main" val="0"/>
+                            </a:ext>
+                          </a:extLst>
+                        </a:blip>
+                        <a:srcRect/>
+                        <a:stretch>
+                          <a:fillRect/>
+                        </a:stretch>
+                      </pic:blipFill>
+                      <pic:spPr bwMode="auto">
+                        <a:xfrm>
+                          <a:off x="0" y="0"/>
+                          <a:ext cx="475584" cy="426090"/>
+                        </a:xfrm>
+                        <a:prstGeom prst="rect">
+                          <a:avLst/>
+                        </a:prstGeom>
+                        <a:noFill/>
+                        <a:ln>
+                          <a:noFill/>
+                        </a:ln>
+                      </pic:spPr>
+                    </pic:pic>
+                  </a:graphicData>
+                </a:graphic>
+              </wp:inline>
+            </w:drawing>
+          </w:r>
         </w:p>
       </w:tc>
       <w:tc>
         <w:tcPr>
-          <w:tcW w:w="1650" w:type="dxa"/>
+          <w:tcW w:w="1565" w:type="dxa"/>
         </w:tcPr>
         <w:p>
-          <w:pPr>
-            <w:rPr>
-              <w:b/>
-              <w:bCs/>
-            </w:rPr>
-          </w:pPr>
           <w:r>
-            <w:rPr>
-              <w:b/>
-              <w:bCs/>
-            </w:rPr>
             <w:t>Nome do Cliente</w:t>
           </w:r>
         </w:p>
       </w:tc>
       <w:tc>
         <w:tcPr>
-          <w:tcW w:w="3261" w:type="dxa"/>
+          <w:tcW w:w="3195" w:type="dxa"/>
           <w:vMerge w:val="restart"/>
           <w:vAlign w:val="center"/>
         </w:tcPr>
@@ -1863,14 +2116,16 @@
     <w:tr>
       <w:trPr>
         <w:trHeight w:val="390"/>
+        <w:jc w:val="center"/>
       </w:trPr>
       <w:tc>
         <w:tcPr>
-          <w:tcW w:w="2205" w:type="dxa"/>
+          <w:tcW w:w="3882" w:type="dxa"/>
         </w:tcPr>
         <w:p>
           <w:pPr>
             <w:pStyle w:val="Cabealho"/>
+            <w:jc w:val="center"/>
             <w:rPr>
               <w:b/>
               <w:bCs/>
@@ -1887,7 +2142,7 @@
       </w:tc>
       <w:tc>
         <w:tcPr>
-          <w:tcW w:w="1650" w:type="dxa"/>
+          <w:tcW w:w="1565" w:type="dxa"/>
         </w:tcPr>
         <w:p>
           <w:pPr>
@@ -1908,7 +2163,7 @@
       </w:tc>
       <w:tc>
         <w:tcPr>
-          <w:tcW w:w="3261" w:type="dxa"/>
+          <w:tcW w:w="3195" w:type="dxa"/>
           <w:vMerge/>
         </w:tcPr>
         <w:p>
@@ -1924,12 +2179,13 @@
     <w:tr>
       <w:trPr>
         <w:gridBefore w:val="1"/>
-        <w:wBefore w:w="2205" w:type="dxa"/>
+        <w:wBefore w:w="3882" w:type="dxa"/>
         <w:trHeight w:val="375"/>
+        <w:jc w:val="center"/>
       </w:trPr>
       <w:tc>
         <w:tcPr>
-          <w:tcW w:w="1650" w:type="dxa"/>
+          <w:tcW w:w="1565" w:type="dxa"/>
         </w:tcPr>
         <w:p>
           <w:pPr>
@@ -1941,17 +2197,27 @@
             </w:rPr>
           </w:pPr>
           <w:r>
+            <w:t>Revisão:</w:t>
+          </w:r>
+          <w:r>
             <w:rPr>
               <w:b/>
               <w:bCs/>
             </w:rPr>
-            <w:t>Revisão: 01</w:t>
+            <w:t xml:space="preserve"> 0</w:t>
+          </w:r>
+          <w:r>
+            <w:rPr>
+              <w:b/>
+              <w:bCs/>
+            </w:rPr>
+            <w:t>2</w:t>
           </w:r>
         </w:p>
       </w:tc>
       <w:tc>
         <w:tcPr>
-          <w:tcW w:w="3261" w:type="dxa"/>
+          <w:tcW w:w="3195" w:type="dxa"/>
         </w:tcPr>
         <w:p>
           <w:pPr>
@@ -1961,11 +2227,14 @@
             </w:rPr>
           </w:pPr>
           <w:r>
+            <w:t>Data:</w:t>
+          </w:r>
+          <w:r>
             <w:rPr>
               <w:b/>
               <w:bCs/>
             </w:rPr>
-            <w:t>Data: 26/06/2026</w:t>
+            <w:t xml:space="preserve"> 26/06/2026</w:t>
           </w:r>
         </w:p>
       </w:tc>
@@ -1993,7 +2262,7 @@
 </file>
 
 <file path=word/numbering.xml><?xml version="1.0" encoding="utf-8"?>
-<w:numbering xmlns:wpc="http://schemas.microsoft.com/office/word/2010/wordprocessingCanvas" xmlns:cx="http://schemas.microsoft.com/office/drawing/2014/chartex" xmlns:cx1="http://schemas.microsoft.com/office/drawing/2015/9/8/chartex" xmlns:cx2="http://schemas.microsoft.com/office/drawing/2015/10/21/chartex" xmlns:cx3="http://schemas.microsoft.com/office/drawing/2016/5/9/chartex" xmlns:cx4="http://schemas.microsoft.com/office/drawing/2016/5/10/chartex" xmlns:cx5="http://schemas.microsoft.com/office/drawing/2016/5/11/chartex" xmlns:cx6="http://schemas.microsoft.com/office/drawing/2016/5/12/chartex" xmlns:cx7="http://schemas.microsoft.com/office/drawing/2016/5/13/chartex" xmlns:cx8="http://schemas.microsoft.com/office/drawing/2016/5/14/chartex" xmlns:mc="http://schemas.openxmlformats.org/markup-compatibility/2006" xmlns:aink="http://schemas.microsoft.com/office/drawing/2016/ink" xmlns:am3d="http://schemas.microsoft.com/office/drawing/2017/model3d" xmlns:o="urn:schemas-microsoft-com:office:office" xmlns:oel="http://schemas.microsoft.com/office/2019/extlst" xmlns:r="http://schemas.openxmlformats.org/officeDocument/2006/relationships" xmlns:m="http://schemas.openxmlformats.org/officeDocument/2006/math" xmlns:v="urn:schemas-microsoft-com:vml" xmlns:wp14="http://schemas.microsoft.com/office/word/2010/wordprocessingDrawing" xmlns:wp="http://schemas.openxmlformats.org/drawingml/2006/wordprocessingDrawing" xmlns:w10="urn:schemas-microsoft-com:office:word" xmlns:w="http://schemas.openxmlformats.org/wordprocessingml/2006/main" xmlns:w14="http://schemas.microsoft.com/office/word/2010/wordml" xmlns:w15="http://schemas.microsoft.com/office/word/2012/wordml" xmlns:w16cex="http://schemas.microsoft.com/office/word/2018/wordml/cex" xmlns:w16cid="http://schemas.microsoft.com/office/word/2016/wordml/cid" xmlns:w16="http://schemas.microsoft.com/office/word/2018/wordml" xmlns:w16du="http://schemas.microsoft.com/office/word/2023/wordml/word16du" xmlns:w16sdtdh="http://schemas.microsoft.com/office/word/2020/wordml/sdtdatahash" xmlns:w16sdtfl="http://schemas.microsoft.com/office/word/2024/wordml/sdtformatlock" xmlns:w16se="http://schemas.microsoft.com/office/word/2015/wordml/symex" xmlns:wpg="http://schemas.microsoft.com/office/word/2010/wordprocessingGroup" xmlns:wpi="http://schemas.microsoft.com/office/word/2010/wordprocessingInk" xmlns:wne="http://schemas.microsoft.com/office/word/2006/wordml" xmlns:wps="http://schemas.microsoft.com/office/word/2010/wordprocessingShape" mc:Ignorable="w14 w15 w16se w16cid w16 w16cex w16sdtdh w16sdtfl w16du wp14">
+<w:numbering xmlns:wpc="http://schemas.microsoft.com/office/word/2010/wordprocessingCanvas" xmlns:cx="http://schemas.microsoft.com/office/drawing/2014/chartex" xmlns:cx1="http://schemas.microsoft.com/office/drawing/2015/9/8/chartex" xmlns:cx2="http://schemas.microsoft.com/office/drawing/2015/10/21/chartex" xmlns:cx3="http://schemas.microsoft.com/office/drawing/2016/5/9/chartex" xmlns:cx4="http://schemas.microsoft.com/office/drawing/2016/5/10/chartex" xmlns:cx5="http://schemas.microsoft.com/office/drawing/2016/5/11/chartex" xmlns:cx6="http://schemas.microsoft.com/office/drawing/2016/5/12/chartex" xmlns:cx7="http://schemas.microsoft.com/office/drawing/2016/5/13/chartex" xmlns:cx8="http://schemas.microsoft.com/office/drawing/2016/5/14/chartex" xmlns:mc="http://schemas.openxmlformats.org/markup-compatibility/2006" xmlns:aink="http://schemas.microsoft.com/office/drawing/2016/ink" xmlns:am3d="http://schemas.microsoft.com/office/drawing/2017/model3d" xmlns:o="urn:schemas-microsoft-com:office:office" xmlns:r="http://schemas.openxmlformats.org/officeDocument/2006/relationships" xmlns:m="http://schemas.openxmlformats.org/officeDocument/2006/math" xmlns:v="urn:schemas-microsoft-com:vml" xmlns:wp14="http://schemas.microsoft.com/office/word/2010/wordprocessingDrawing" xmlns:wp="http://schemas.openxmlformats.org/drawingml/2006/wordprocessingDrawing" xmlns:w10="urn:schemas-microsoft-com:office:word" xmlns:w="http://schemas.openxmlformats.org/wordprocessingml/2006/main" xmlns:w14="http://schemas.microsoft.com/office/word/2010/wordml" xmlns:w15="http://schemas.microsoft.com/office/word/2012/wordml" xmlns:w16cex="http://schemas.microsoft.com/office/word/2018/wordml/cex" xmlns:w16cid="http://schemas.microsoft.com/office/word/2016/wordml/cid" xmlns:w16="http://schemas.microsoft.com/office/word/2018/wordml" xmlns:w16sdtdh="http://schemas.microsoft.com/office/word/2020/wordml/sdtdatahash" xmlns:w16se="http://schemas.microsoft.com/office/word/2015/wordml/symex" xmlns:wpg="http://schemas.microsoft.com/office/word/2010/wordprocessingGroup" xmlns:wpi="http://schemas.microsoft.com/office/word/2010/wordprocessingInk" xmlns:wne="http://schemas.microsoft.com/office/word/2006/wordml" xmlns:wps="http://schemas.microsoft.com/office/word/2010/wordprocessingShape" mc:Ignorable="w14 w15 w16se w16cid w16 w16cex w16sdtdh wp14">
   <w:abstractNum w:abstractNumId="0" w15:restartNumberingAfterBreak="0">
     <w:nsid w:val="18970677"/>
     <w:multiLevelType w:val="hybridMultilevel"/>
@@ -2535,26 +2804,26 @@
       </w:rPr>
     </w:lvl>
   </w:abstractNum>
-  <w:num w:numId="1" w16cid:durableId="1432891805">
+  <w:num w:numId="1">
     <w:abstractNumId w:val="0"/>
   </w:num>
-  <w:num w:numId="2" w16cid:durableId="1374574599">
+  <w:num w:numId="2">
     <w:abstractNumId w:val="3"/>
   </w:num>
-  <w:num w:numId="3" w16cid:durableId="633755842">
+  <w:num w:numId="3">
     <w:abstractNumId w:val="2"/>
   </w:num>
-  <w:num w:numId="4" w16cid:durableId="712074482">
+  <w:num w:numId="4">
     <w:abstractNumId w:val="1"/>
   </w:num>
-  <w:num w:numId="5" w16cid:durableId="1352221285">
+  <w:num w:numId="5">
     <w:abstractNumId w:val="4"/>
   </w:num>
 </w:numbering>
 </file>
 
 <file path=word/styles.xml><?xml version="1.0" encoding="utf-8"?>
-<w:styles xmlns:mc="http://schemas.openxmlformats.org/markup-compatibility/2006" xmlns:r="http://schemas.openxmlformats.org/officeDocument/2006/relationships" xmlns:w="http://schemas.openxmlformats.org/wordprocessingml/2006/main" xmlns:w14="http://schemas.microsoft.com/office/word/2010/wordml" xmlns:w15="http://schemas.microsoft.com/office/word/2012/wordml" xmlns:w16cex="http://schemas.microsoft.com/office/word/2018/wordml/cex" xmlns:w16cid="http://schemas.microsoft.com/office/word/2016/wordml/cid" xmlns:w16="http://schemas.microsoft.com/office/word/2018/wordml" xmlns:w16du="http://schemas.microsoft.com/office/word/2023/wordml/word16du" xmlns:w16sdtdh="http://schemas.microsoft.com/office/word/2020/wordml/sdtdatahash" xmlns:w16sdtfl="http://schemas.microsoft.com/office/word/2024/wordml/sdtformatlock" xmlns:w16se="http://schemas.microsoft.com/office/word/2015/wordml/symex" mc:Ignorable="w14 w15 w16se w16cid w16 w16cex w16sdtdh w16sdtfl w16du">
+<w:styles xmlns:mc="http://schemas.openxmlformats.org/markup-compatibility/2006" xmlns:r="http://schemas.openxmlformats.org/officeDocument/2006/relationships" xmlns:w="http://schemas.openxmlformats.org/wordprocessingml/2006/main" xmlns:w14="http://schemas.microsoft.com/office/word/2010/wordml" xmlns:w15="http://schemas.microsoft.com/office/word/2012/wordml" xmlns:w16cex="http://schemas.microsoft.com/office/word/2018/wordml/cex" xmlns:w16cid="http://schemas.microsoft.com/office/word/2016/wordml/cid" xmlns:w16="http://schemas.microsoft.com/office/word/2018/wordml" xmlns:w16sdtdh="http://schemas.microsoft.com/office/word/2020/wordml/sdtdatahash" xmlns:w16se="http://schemas.microsoft.com/office/word/2015/wordml/symex" mc:Ignorable="w14 w15 w16se w16cid w16 w16cex w16sdtdh">
   <w:docDefaults>
     <w:rPrDefault>
       <w:rPr>
@@ -3531,6 +3800,22 @@
     <w:uiPriority w:val="99"/>
     <w:rsid w:val="009F5E18"/>
   </w:style>
+  <w:style w:type="paragraph" w:styleId="NormalWeb">
+    <w:name w:val="Normal (Web)"/>
+    <w:basedOn w:val="Normal"/>
+    <w:uiPriority w:val="99"/>
+    <w:unhideWhenUsed/>
+    <w:rsid w:val="000A3BEE"/>
+    <w:pPr>
+      <w:spacing w:before="100" w:beforeAutospacing="1" w:after="100" w:afterAutospacing="1" w:line="240" w:lineRule="auto"/>
+    </w:pPr>
+    <w:rPr>
+      <w:rFonts w:ascii="Times New Roman" w:eastAsia="Times New Roman" w:hAnsi="Times New Roman" w:cs="Times New Roman"/>
+      <w:sz w:val="24"/>
+      <w:szCs w:val="24"/>
+      <w:lang w:eastAsia="pt-BR"/>
+    </w:rPr>
+  </w:style>
 </w:styles>
 </file>
 

</xml_diff>